<commit_message>
Re-insert Recommendations across deck, report, and speaker notes
Deck: new slide 11 with full-bleed navy background and four
gold-numbered (01–04) recommendation badges, inserted between Peer
Benchmark and Methodology. Methodology shifts to slide 12.

Report: new Section "Recommendations" with four subsections
(6.1–6.4) before Methodology. Subsection rendering now allows a
chart=None so non-chart subsections render with heading + narrative
only.

Speaker notes: new slide-11 entry with paragraph-style "What to say"
content (one paragraph framing the section plus one paragraph per
recommendation), a "Key points" bullet list, and a TIP box.
Methodology heading renumbered to slide 12.

Co-Authored-By: Claude Opus 4.7 (1M context) <noreply@anthropic.com>
</commit_message>
<xml_diff>
--- a/deliverables/emory_grad_pricing_report_v2.docx
+++ b/deliverables/emory_grad_pricing_report_v2.docx
@@ -1002,6 +1002,174 @@
           <w:color w:val="012169"/>
           <w:sz w:val="36"/>
         </w:rPr>
+        <w:t>Recommendations</w:t>
+      </w:r>
+    </w:p>
+    <w:tbl>
+      <w:tblPr>
+        <w:tblW w:type="auto" w:w="0"/>
+        <w:tblLook w:firstColumn="1" w:firstRow="1" w:lastColumn="0" w:lastRow="0" w:noHBand="0" w:noVBand="1" w:val="04A0"/>
+      </w:tblPr>
+      <w:tblGrid>
+        <w:gridCol w:w="8640"/>
+      </w:tblGrid>
+      <w:tr>
+        <w:tc>
+          <w:tcPr>
+            <w:tcW w:type="dxa" w:w="8640"/>
+            <w:tcBorders>
+              <w:top w:val="nil"/>
+              <w:left w:val="nil"/>
+              <w:right w:val="nil"/>
+              <w:bottom w:val="single" w:sz="18" w:color="F2A900"/>
+            </w:tcBorders>
+          </w:tcPr>
+          <w:p>
+            <w:pPr>
+              <w:spacing w:before="0" w:after="0"/>
+            </w:pPr>
+            <w:r/>
+          </w:p>
+        </w:tc>
+      </w:tr>
+    </w:tbl>
+    <w:p>
+      <w:pPr>
+        <w:spacing w:after="160"/>
+      </w:pPr>
+      <w:r>
+        <w:rPr>
+          <w:rFonts w:ascii="Calibri" w:hAnsi="Calibri"/>
+          <w:color w:val="222222"/>
+          <w:sz w:val="22"/>
+        </w:rPr>
+        <w:t>Four pricing-strategy questions emerge from the analysis. Each is scoped to be actionable by LGS leadership in a single review cycle: a data audit, an aid-strategy review, a sticker-price test, and a policy codification.</w:t>
+      </w:r>
+    </w:p>
+    <w:p>
+      <w:pPr>
+        <w:spacing w:before="240" w:after="80"/>
+      </w:pPr>
+      <w:r>
+        <w:rPr>
+          <w:rFonts w:ascii="Calibri" w:hAnsi="Calibri"/>
+          <w:b/>
+          <w:color w:val="012169"/>
+          <w:sz w:val="28"/>
+        </w:rPr>
+        <w:t>6.1 — Audit Data Science &amp; MBID scholarship eligibility</w:t>
+      </w:r>
+    </w:p>
+    <w:p>
+      <w:pPr>
+        <w:spacing w:after="160"/>
+      </w:pPr>
+      <w:r>
+        <w:rPr>
+          <w:rFonts w:ascii="Calibri" w:hAnsi="Calibri"/>
+          <w:color w:val="222222"/>
+          <w:sz w:val="22"/>
+        </w:rPr>
+        <w:t>Both programs show 0% kept LGS scholarship across the 8-year panel (Data Science n=11, MBID n=8). Either the awards are not being made or they are landing under descriptions excluded by the LGS-only filter. A manual reconciliation against the raw FA ledger confirms which it is. If the absence of aid is genuine, decide whether it reflects an intentional full-pay positioning or an oversight that is costing yield against more aggressively discounted peer programs.</w:t>
+      </w:r>
+    </w:p>
+    <w:p>
+      <w:pPr>
+        <w:spacing w:before="240" w:after="80"/>
+      </w:pPr>
+      <w:r>
+        <w:rPr>
+          <w:rFonts w:ascii="Calibri" w:hAnsi="Calibri"/>
+          <w:b/>
+          <w:color w:val="012169"/>
+          <w:sz w:val="28"/>
+        </w:rPr>
+        <w:t>6.2 — Review CS aid strategy relative to international demand</w:t>
+      </w:r>
+    </w:p>
+    <w:p>
+      <w:pPr>
+        <w:spacing w:after="160"/>
+      </w:pPr>
+      <w:r>
+        <w:rPr>
+          <w:rFonts w:ascii="Calibri" w:hAnsi="Calibri"/>
+          <w:color w:val="222222"/>
+          <w:sz w:val="22"/>
+        </w:rPr>
+        <w:t>Computer Science is 86% international and still discounts ~49% per student — the highest international share and one of the deepest discounts in the LGS portfolio. There is no inverse relationship between international share and aid in the data, which contradicts the common assumption that international students subsidize domestic ones. The strategic question is whether the 49% discount is necessary to land these students given that Columbia and NYU charge $20–40k more in absolute terms; a yield-elasticity test on the next admit cycle would quantify the lift per aid dollar.</w:t>
+      </w:r>
+    </w:p>
+    <w:p>
+      <w:pPr>
+        <w:spacing w:before="240" w:after="80"/>
+      </w:pPr>
+      <w:r>
+        <w:rPr>
+          <w:rFonts w:ascii="Calibri" w:hAnsi="Calibri"/>
+          <w:b/>
+          <w:color w:val="012169"/>
+          <w:sz w:val="28"/>
+        </w:rPr>
+        <w:t>6.3 — Capitalize on the peer pricing gap</w:t>
+      </w:r>
+    </w:p>
+    <w:p>
+      <w:pPr>
+        <w:spacing w:after="160"/>
+      </w:pPr>
+      <w:r>
+        <w:rPr>
+          <w:rFonts w:ascii="Calibri" w:hAnsi="Calibri"/>
+          <w:color w:val="222222"/>
+          <w:sz w:val="22"/>
+        </w:rPr>
+        <w:t>Annualized gross tuition sits comfortably below Columbia and NYU ($65–91k) and clearly above Georgia Tech's in-state floor ($31–41k). With CS enrollment roughly doubling since 2022, demand for Emory's mid-tier positioning is responding. A selective sticker-price increase of $5–8k in the most-demanded programs (CS, MDP) would still leave Emory comfortably below the urban-elite tier and would generate meaningful incremental revenue without changing market position.</w:t>
+      </w:r>
+    </w:p>
+    <w:p>
+      <w:pPr>
+        <w:spacing w:before="240" w:after="80"/>
+      </w:pPr>
+      <w:r>
+        <w:rPr>
+          <w:rFonts w:ascii="Calibri" w:hAnsi="Calibri"/>
+          <w:b/>
+          <w:color w:val="012169"/>
+          <w:sz w:val="28"/>
+        </w:rPr>
+        <w:t>6.4 — Stabilize MDP discount rate with a formal aid policy</w:t>
+      </w:r>
+    </w:p>
+    <w:p>
+      <w:pPr>
+        <w:spacing w:after="160"/>
+      </w:pPr>
+      <w:r>
+        <w:rPr>
+          <w:rFonts w:ascii="Calibri" w:hAnsi="Calibri"/>
+          <w:color w:val="222222"/>
+          <w:sz w:val="22"/>
+        </w:rPr>
+        <w:t>MDP discounts at 55% career-wide — the highest in the portfolio — and the per-semester view shows the give is concentrated in Summer ($22k gross → $2.3k net). Year-to-year the program rate hovers in a 55–60% band, which suggests the practice is implicit rather than codified. Document the decision rule (eligibility, award size, term distribution) so future cohorts are predictable and so the rate can be tuned deliberately rather than by drift.</w:t>
+      </w:r>
+    </w:p>
+    <w:p>
+      <w:r>
+        <w:br w:type="page"/>
+      </w:r>
+    </w:p>
+    <w:p>
+      <w:pPr>
+        <w:spacing w:before="240" w:after="80"/>
+      </w:pPr>
+      <w:r>
+        <w:rPr>
+          <w:rFonts w:ascii="Calibri" w:hAnsi="Calibri"/>
+          <w:b/>
+          <w:color w:val="012169"/>
+          <w:sz w:val="36"/>
+        </w:rPr>
         <w:t>Data &amp; Methodology</w:t>
       </w:r>
     </w:p>

</xml_diff>

<commit_message>
Rework intl mix scatter: log x-axis, larger figure, left-panel slide
Chart updates: figsize 10x7 -> 14x9, symlog x-axis with explicit ticks
[0,1,2,5,10,20,40,80] to spread out the cluster of programs near 0%
intl share, MBID/Data Science labels split +/-1.5 pct so the (0%, 0%)
overlap is gone, bubbles ~60% larger so small-n programs remain
visible.

Deck slide 7 now uses the left navy panel layout (matching the per-
semester slides) instead of the full-width headline strip, and
build_left_panel_chart_slide reads the chart's true aspect via PIL
so the new 14:9 source PNG fits correctly alongside the 11:6 charts.

Co-Authored-By: Claude Opus 4.7 (1M context) <noreply@anthropic.com>
</commit_message>
<xml_diff>
--- a/deliverables/emory_grad_pricing_report_v2.docx
+++ b/deliverables/emory_grad_pricing_report_v2.docx
@@ -756,7 +756,7 @@
       <w:r>
         <w:drawing>
           <wp:inline xmlns:a="http://schemas.openxmlformats.org/drawingml/2006/main" xmlns:pic="http://schemas.openxmlformats.org/drawingml/2006/picture">
-            <wp:extent cx="5943600" cy="3857915"/>
+            <wp:extent cx="5943600" cy="3575165"/>
             <wp:docPr id="6" name="Picture 6"/>
             <wp:cNvGraphicFramePr>
               <a:graphicFrameLocks noChangeAspect="1"/>
@@ -777,7 +777,7 @@
                   <pic:spPr>
                     <a:xfrm>
                       <a:off x="0" y="0"/>
-                      <a:ext cx="5943600" cy="3857915"/>
+                      <a:ext cx="5943600" cy="3575165"/>
                     </a:xfrm>
                     <a:prstGeom prst="rect"/>
                   </pic:spPr>

</xml_diff>